<commit_message>
Update: ├änderungen lokaler Stand
</commit_message>
<xml_diff>
--- a/Anleitung_PeerTube_Plugins_Moodle.docx
+++ b/Anleitung_PeerTube_Plugins_Moodle.docx
@@ -1951,7 +1951,7 @@
                 <w:sz w:val="18"/>
                 <w:szCs w:val="18"/>
               </w:rPr>
-              <w:t xml:space="preserve">Instanzen auf Kursebene</w:t>
+              <w:t xml:space="preserve">Embed-URL-Parameter</w:t>
             </w:r>
           </w:p>
         </w:tc>
@@ -1988,7 +1988,7 @@
                 <w:sz w:val="18"/>
                 <w:szCs w:val="18"/>
               </w:rPr>
-              <w:t xml:space="preserve">Kann aktiviert bleiben</w:t>
+              <w:t xml:space="preserve">Datenschutz-Parameter für eingebettete Videos. Standard: peertubeLink=0&amp;p2p=0&amp;warningTitle=0 – deaktiviert P2P (Zuschauer-IP wird nicht geteilt), entfernt Link und IP-Warnhinweis im Player</w:t>
             </w:r>
           </w:p>
         </w:tc>
@@ -2027,7 +2027,7 @@
                 <w:sz w:val="18"/>
                 <w:szCs w:val="18"/>
               </w:rPr>
-              <w:t xml:space="preserve">Instanzen auf Nutzerebene</w:t>
+              <w:t xml:space="preserve">Instanzen auf Kursebene</w:t>
             </w:r>
           </w:p>
         </w:tc>
@@ -2041,6 +2041,82 @@
               <w:right w:val="single" w:color="AAAAAA" w:sz="4"/>
             </w:tcBorders>
             <w:shd w:fill="FFFFFF" w:val="clear"/>
+            <w:tcMar>
+              <w:top w:type="dxa" w:w="60"/>
+              <w:left w:type="dxa" w:w="120"/>
+              <w:bottom w:type="dxa" w:w="60"/>
+              <w:right w:type="dxa" w:w="120"/>
+            </w:tcMar>
+          </w:tcPr>
+          <w:p>
+            <w:pPr>
+              <w:spacing w:after="0" w:before="0"/>
+              <w:jc w:val="left"/>
+            </w:pPr>
+            <w:r>
+              <w:rPr>
+                <w:rFonts w:ascii="Arial" w:cs="Arial" w:eastAsia="Arial" w:hAnsi="Arial"/>
+                <w:b w:val="false"/>
+                <w:bCs w:val="false"/>
+                <w:i w:val="false"/>
+                <w:iCs w:val="false"/>
+                <w:color w:val="000000"/>
+                <w:sz w:val="18"/>
+                <w:szCs w:val="18"/>
+              </w:rPr>
+              <w:t xml:space="preserve">Kann aktiviert bleiben</w:t>
+            </w:r>
+          </w:p>
+        </w:tc>
+      </w:tr>
+      <w:tr>
+        <w:tc>
+          <w:tcPr>
+            <w:tcW w:type="dxa" w:w="3200"/>
+            <w:tcBorders>
+              <w:top w:val="single" w:color="AAAAAA" w:sz="4"/>
+              <w:left w:val="single" w:color="AAAAAA" w:sz="4"/>
+              <w:bottom w:val="single" w:color="AAAAAA" w:sz="4"/>
+              <w:right w:val="single" w:color="AAAAAA" w:sz="4"/>
+            </w:tcBorders>
+            <w:shd w:fill="F2F2F2" w:val="clear"/>
+            <w:tcMar>
+              <w:top w:type="dxa" w:w="60"/>
+              <w:left w:type="dxa" w:w="120"/>
+              <w:bottom w:type="dxa" w:w="60"/>
+              <w:right w:type="dxa" w:w="120"/>
+            </w:tcMar>
+          </w:tcPr>
+          <w:p>
+            <w:pPr>
+              <w:spacing w:after="0" w:before="0"/>
+              <w:jc w:val="left"/>
+            </w:pPr>
+            <w:r>
+              <w:rPr>
+                <w:rFonts w:ascii="Arial" w:cs="Arial" w:eastAsia="Arial" w:hAnsi="Arial"/>
+                <w:b/>
+                <w:bCs/>
+                <w:i w:val="false"/>
+                <w:iCs w:val="false"/>
+                <w:color w:val="000000"/>
+                <w:sz w:val="18"/>
+                <w:szCs w:val="18"/>
+              </w:rPr>
+              <w:t xml:space="preserve">Instanzen auf Nutzerebene</w:t>
+            </w:r>
+          </w:p>
+        </w:tc>
+        <w:tc>
+          <w:tcPr>
+            <w:tcW w:type="dxa" w:w="5826"/>
+            <w:tcBorders>
+              <w:top w:val="single" w:color="AAAAAA" w:sz="4"/>
+              <w:left w:val="single" w:color="AAAAAA" w:sz="4"/>
+              <w:bottom w:val="single" w:color="AAAAAA" w:sz="4"/>
+              <w:right w:val="single" w:color="AAAAAA" w:sz="4"/>
+            </w:tcBorders>
+            <w:shd w:fill="F2F2F2" w:val="clear"/>
             <w:tcMar>
               <w:top w:type="dxa" w:w="60"/>
               <w:left w:type="dxa" w:w="120"/>
@@ -4354,7 +4430,7 @@
           <w:sz w:val="20"/>
           <w:szCs w:val="20"/>
         </w:rPr>
-        <w:t xml:space="preserve">Es gibt zwei gleichwertige Wege, ein PeerTube-Video in Moodle einzubetten. Beide erzeugen dasselbe Ergebnis: ein eingebettetes, abspielferties Video direkt auf der Kursseite.</w:t>
+        <w:t xml:space="preserve">Es gibt zwei gleichwertige Wege, ein PeerTube-Video in Moodle einzubetten. Beide erzeugen dasselbe Ergebnis: ein eingebettetes, abspielfertiges Video direkt auf der Kursseite.</w:t>
       </w:r>
     </w:p>
     <w:p>
@@ -6780,12 +6856,470 @@
       </w:pPr>
       <w:r>
         <w:rPr>
+          <w:sz w:val="20"/>
+          <w:szCs w:val="20"/>
+        </w:rPr>
+        <w:t xml:space="preserve"/>
+      </w:r>
+    </w:p>
+    <w:p>
+      <w:pPr>
+        <w:pStyle w:val="Heading2"/>
+        <w:spacing w:after="80" w:before="240"/>
+      </w:pPr>
+      <w:r>
+        <w:rPr>
+          <w:rFonts w:ascii="Arial" w:cs="Arial" w:eastAsia="Arial" w:hAnsi="Arial"/>
+          <w:b/>
+          <w:bCs/>
+          <w:i w:val="false"/>
+          <w:iCs w:val="false"/>
+          <w:color w:val="2E75B6"/>
+          <w:sz w:val="24"/>
+          <w:szCs w:val="24"/>
+        </w:rPr>
+        <w:t xml:space="preserve">B.5  Datenschutz: Was „Nicht gelistet“ bedeutet</w:t>
+      </w:r>
+    </w:p>
+    <w:p>
+      <w:pPr>
+        <w:spacing w:after="80" w:before="80"/>
+        <w:jc w:val="left"/>
+      </w:pPr>
+      <w:r>
+        <w:rPr>
+          <w:rFonts w:ascii="Arial" w:cs="Arial" w:eastAsia="Arial" w:hAnsi="Arial"/>
+          <w:b w:val="false"/>
+          <w:bCs w:val="false"/>
+          <w:i w:val="false"/>
+          <w:iCs w:val="false"/>
+          <w:color w:val="000000"/>
+          <w:sz w:val="20"/>
+          <w:szCs w:val="20"/>
+        </w:rPr>
+        <w:t xml:space="preserve">Videos, die über Moodle eingebunden werden, sind auf PeerTube als Nicht gelistet markiert. Es ist wichtig zu verstehen, was diese Einstellung leistet – und was nicht.</w:t>
+      </w:r>
+    </w:p>
+    <w:p>
+      <w:pPr>
+        <w:spacing w:after="0" w:before="0"/>
+      </w:pPr>
+      <w:r>
+        <w:rPr>
+          <w:sz w:val="12"/>
+          <w:szCs w:val="12"/>
+        </w:rPr>
+        <w:t xml:space="preserve"/>
+      </w:r>
+    </w:p>
+    <w:tbl>
+      <w:tblPr>
+        <w:tblW w:type="dxa" w:w="9026"/>
+        <w:tblBorders>
+          <w:top w:val="single" w:color="auto" w:sz="4"/>
+          <w:left w:val="single" w:color="auto" w:sz="4"/>
+          <w:bottom w:val="single" w:color="auto" w:sz="4"/>
+          <w:right w:val="single" w:color="auto" w:sz="4"/>
+          <w:insideH w:val="single" w:color="auto" w:sz="4"/>
+          <w:insideV w:val="single" w:color="auto" w:sz="4"/>
+        </w:tblBorders>
+      </w:tblPr>
+      <w:tblGrid>
+        <w:gridCol w:w="3200"/>
+        <w:gridCol w:w="5826"/>
+      </w:tblGrid>
+      <w:tr>
+        <w:tc>
+          <w:tcPr>
+            <w:tcW w:type="dxa" w:w="3200"/>
+            <w:tcBorders>
+              <w:top w:val="single" w:color="AAAAAA" w:sz="4"/>
+              <w:left w:val="single" w:color="AAAAAA" w:sz="4"/>
+              <w:bottom w:val="single" w:color="AAAAAA" w:sz="4"/>
+              <w:right w:val="single" w:color="AAAAAA" w:sz="4"/>
+            </w:tcBorders>
+            <w:shd w:fill="E2EFDA" w:val="clear"/>
+            <w:tcMar>
+              <w:top w:type="dxa" w:w="70"/>
+              <w:left w:type="dxa" w:w="120"/>
+              <w:bottom w:type="dxa" w:w="70"/>
+              <w:right w:type="dxa" w:w="120"/>
+            </w:tcMar>
+          </w:tcPr>
+          <w:p>
+            <w:pPr>
+              <w:spacing w:after="0" w:before="0"/>
+              <w:jc w:val="left"/>
+            </w:pPr>
+            <w:r>
+              <w:rPr>
+                <w:rFonts w:ascii="Arial" w:cs="Arial" w:eastAsia="Arial" w:hAnsi="Arial"/>
+                <w:b/>
+                <w:bCs/>
+                <w:i w:val="false"/>
+                <w:iCs w:val="false"/>
+                <w:color w:val="375623"/>
+                <w:sz w:val="18"/>
+                <w:szCs w:val="18"/>
+              </w:rPr>
+              <w:t xml:space="preserve">Was „Nicht gelistet“ leistet</w:t>
+            </w:r>
+          </w:p>
+        </w:tc>
+        <w:tc>
+          <w:tcPr>
+            <w:tcW w:type="dxa" w:w="5826"/>
+            <w:tcBorders>
+              <w:top w:val="single" w:color="AAAAAA" w:sz="4"/>
+              <w:left w:val="single" w:color="AAAAAA" w:sz="4"/>
+              <w:bottom w:val="single" w:color="AAAAAA" w:sz="4"/>
+              <w:right w:val="single" w:color="AAAAAA" w:sz="4"/>
+            </w:tcBorders>
+            <w:shd w:fill="E2EFDA" w:val="clear"/>
+            <w:tcMar>
+              <w:top w:type="dxa" w:w="70"/>
+              <w:left w:type="dxa" w:w="120"/>
+              <w:bottom w:type="dxa" w:w="70"/>
+              <w:right w:type="dxa" w:w="120"/>
+            </w:tcMar>
+          </w:tcPr>
+          <w:p>
+            <w:pPr>
+              <w:spacing w:after="0" w:before="0"/>
+              <w:jc w:val="left"/>
+            </w:pPr>
+            <w:r>
+              <w:rPr>
+                <w:rFonts w:ascii="Arial" w:cs="Arial" w:eastAsia="Arial" w:hAnsi="Arial"/>
+                <w:b w:val="false"/>
+                <w:bCs w:val="false"/>
+                <w:i w:val="false"/>
+                <w:iCs w:val="false"/>
+                <w:color w:val="000000"/>
+                <w:sz w:val="18"/>
+                <w:szCs w:val="18"/>
+              </w:rPr>
+              <w:t xml:space="preserve">Das Video ist nicht über die PeerTube-Suche auffindbar und nicht öffentlich gelistet. Es erscheint nur dort, wo Sie den Link einbinden.</w:t>
+            </w:r>
+          </w:p>
+        </w:tc>
+      </w:tr>
+      <w:tr>
+        <w:tc>
+          <w:tcPr>
+            <w:tcW w:type="dxa" w:w="3200"/>
+            <w:tcBorders>
+              <w:top w:val="single" w:color="AAAAAA" w:sz="4"/>
+              <w:left w:val="single" w:color="AAAAAA" w:sz="4"/>
+              <w:bottom w:val="single" w:color="AAAAAA" w:sz="4"/>
+              <w:right w:val="single" w:color="AAAAAA" w:sz="4"/>
+            </w:tcBorders>
+            <w:shd w:fill="FCE4D6" w:val="clear"/>
+            <w:tcMar>
+              <w:top w:type="dxa" w:w="70"/>
+              <w:left w:type="dxa" w:w="120"/>
+              <w:bottom w:type="dxa" w:w="70"/>
+              <w:right w:type="dxa" w:w="120"/>
+            </w:tcMar>
+          </w:tcPr>
+          <w:p>
+            <w:pPr>
+              <w:spacing w:after="0" w:before="0"/>
+              <w:jc w:val="left"/>
+            </w:pPr>
+            <w:r>
+              <w:rPr>
+                <w:rFonts w:ascii="Arial" w:cs="Arial" w:eastAsia="Arial" w:hAnsi="Arial"/>
+                <w:b/>
+                <w:bCs/>
+                <w:i w:val="false"/>
+                <w:iCs w:val="false"/>
+                <w:color w:val="843C0C"/>
+                <w:sz w:val="18"/>
+                <w:szCs w:val="18"/>
+              </w:rPr>
+              <w:t xml:space="preserve">Was es NICHT leistet</w:t>
+            </w:r>
+          </w:p>
+        </w:tc>
+        <w:tc>
+          <w:tcPr>
+            <w:tcW w:type="dxa" w:w="5826"/>
+            <w:tcBorders>
+              <w:top w:val="single" w:color="AAAAAA" w:sz="4"/>
+              <w:left w:val="single" w:color="AAAAAA" w:sz="4"/>
+              <w:bottom w:val="single" w:color="AAAAAA" w:sz="4"/>
+              <w:right w:val="single" w:color="AAAAAA" w:sz="4"/>
+            </w:tcBorders>
+            <w:shd w:fill="FCE4D6" w:val="clear"/>
+            <w:tcMar>
+              <w:top w:type="dxa" w:w="70"/>
+              <w:left w:type="dxa" w:w="120"/>
+              <w:bottom w:type="dxa" w:w="70"/>
+              <w:right w:type="dxa" w:w="120"/>
+            </w:tcMar>
+          </w:tcPr>
+          <w:p>
+            <w:pPr>
+              <w:spacing w:after="0" w:before="0"/>
+              <w:jc w:val="left"/>
+            </w:pPr>
+            <w:r>
+              <w:rPr>
+                <w:rFonts w:ascii="Arial" w:cs="Arial" w:eastAsia="Arial" w:hAnsi="Arial"/>
+                <w:b w:val="false"/>
+                <w:bCs w:val="false"/>
+                <w:i w:val="false"/>
+                <w:iCs w:val="false"/>
+                <w:color w:val="000000"/>
+                <w:sz w:val="18"/>
+                <w:szCs w:val="18"/>
+              </w:rPr>
+              <w:t xml:space="preserve">Es ist kein Zugriffsschutz. Wer den direkten Link zum Video kennt, kann es ansehen – auch ohne Moodle-Konto und ohne Kurszugehörigkeit.</w:t>
+            </w:r>
+          </w:p>
+        </w:tc>
+      </w:tr>
+    </w:tbl>
+    <w:p>
+      <w:pPr>
+        <w:spacing w:after="0" w:before="0"/>
+      </w:pPr>
+      <w:r>
+        <w:rPr>
           <w:sz w:val="16"/>
           <w:szCs w:val="16"/>
         </w:rPr>
         <w:t xml:space="preserve"/>
       </w:r>
     </w:p>
+    <w:p>
+      <w:pPr>
+        <w:spacing w:after="80" w:before="80"/>
+        <w:jc w:val="left"/>
+      </w:pPr>
+      <w:r>
+        <w:rPr>
+          <w:rFonts w:ascii="Arial" w:cs="Arial" w:eastAsia="Arial" w:hAnsi="Arial"/>
+          <w:b w:val="false"/>
+          <w:bCs w:val="false"/>
+          <w:i w:val="false"/>
+          <w:iCs w:val="false"/>
+          <w:color w:val="000000"/>
+          <w:sz w:val="20"/>
+          <w:szCs w:val="20"/>
+        </w:rPr>
+        <w:t xml:space="preserve">Die Video-Adresse ist technisch im Quelltext der Kursseite enthalten. Kenntnisreiche Personen können die Adresse dort auslesen, kopieren und an Dritte weitergeben. Der eingebaute Datenschutz-Parameter p2p=0 verhindert zwar, dass die IP-Adressen der Zuschauer an andere Zuschauer weitergegeben werden – er kann aber nicht verhindern, dass ein weitergegebener Link funktioniert.</w:t>
+      </w:r>
+    </w:p>
+    <w:p>
+      <w:pPr>
+        <w:spacing w:after="0" w:before="0"/>
+      </w:pPr>
+      <w:r>
+        <w:rPr>
+          <w:sz w:val="12"/>
+          <w:szCs w:val="12"/>
+        </w:rPr>
+        <w:t xml:space="preserve"/>
+      </w:r>
+    </w:p>
+    <w:tbl>
+      <w:tblPr>
+        <w:tblW w:type="dxa" w:w="9026"/>
+        <w:tblBorders>
+          <w:top w:val="single" w:color="843C0C" w:sz="4"/>
+          <w:left w:val="thick" w:color="843C0C" w:sz="16"/>
+          <w:bottom w:val="single" w:color="843C0C" w:sz="4"/>
+          <w:right w:val="single" w:color="843C0C" w:sz="4"/>
+          <w:insideH w:val="single" w:color="auto" w:sz="4"/>
+          <w:insideV w:val="single" w:color="auto" w:sz="4"/>
+        </w:tblBorders>
+      </w:tblPr>
+      <w:tblGrid>
+        <w:gridCol w:w="9026"/>
+      </w:tblGrid>
+      <w:tr>
+        <w:tc>
+          <w:tcPr>
+            <w:tcBorders>
+              <w:top w:val="none" w:color="AAAAAA" w:sz="4"/>
+              <w:left w:val="none" w:color="AAAAAA" w:sz="4"/>
+              <w:bottom w:val="none" w:color="AAAAAA" w:sz="4"/>
+              <w:right w:val="none" w:color="AAAAAA" w:sz="4"/>
+            </w:tcBorders>
+            <w:shd w:fill="FCE4D6" w:val="clear"/>
+            <w:tcMar>
+              <w:top w:type="dxa" w:w="60"/>
+              <w:left w:type="dxa" w:w="140"/>
+              <w:bottom w:type="dxa" w:w="20"/>
+              <w:right w:type="dxa" w:w="140"/>
+            </w:tcMar>
+          </w:tcPr>
+          <w:p>
+            <w:pPr>
+              <w:spacing w:after="0" w:before="0"/>
+              <w:jc w:val="left"/>
+            </w:pPr>
+            <w:r>
+              <w:rPr>
+                <w:rFonts w:ascii="Arial" w:cs="Arial" w:eastAsia="Arial" w:hAnsi="Arial"/>
+                <w:b/>
+                <w:bCs/>
+                <w:i w:val="false"/>
+                <w:iCs w:val="false"/>
+                <w:color w:val="843C0C"/>
+                <w:sz w:val="18"/>
+                <w:szCs w:val="18"/>
+              </w:rPr>
+              <w:t xml:space="preserve">⚠  Wichtige Regel: Keine sensiblen Inhalte über PeerTube</w:t>
+            </w:r>
+          </w:p>
+        </w:tc>
+      </w:tr>
+      <w:tr>
+        <w:tc>
+          <w:tcPr>
+            <w:tcBorders>
+              <w:top w:val="none" w:color="AAAAAA" w:sz="4"/>
+              <w:left w:val="none" w:color="AAAAAA" w:sz="4"/>
+              <w:bottom w:val="none" w:color="AAAAAA" w:sz="4"/>
+              <w:right w:val="none" w:color="AAAAAA" w:sz="4"/>
+            </w:tcBorders>
+            <w:shd w:fill="FCE4D6" w:val="clear"/>
+            <w:tcMar>
+              <w:top w:type="dxa" w:w="30"/>
+              <w:left w:type="dxa" w:w="140"/>
+              <w:bottom w:type="dxa" w:w="30"/>
+              <w:right w:type="dxa" w:w="140"/>
+            </w:tcMar>
+          </w:tcPr>
+          <w:p>
+            <w:pPr>
+              <w:spacing w:after="0" w:before="0"/>
+              <w:jc w:val="left"/>
+            </w:pPr>
+            <w:r>
+              <w:rPr>
+                <w:rFonts w:ascii="Arial" w:cs="Arial" w:eastAsia="Arial" w:hAnsi="Arial"/>
+                <w:b w:val="false"/>
+                <w:bCs w:val="false"/>
+                <w:i w:val="false"/>
+                <w:iCs w:val="false"/>
+                <w:color w:val="000000"/>
+                <w:sz w:val="18"/>
+                <w:szCs w:val="18"/>
+              </w:rPr>
+              <w:t xml:space="preserve">Setzen Sie daher keine sensiblen oder personenbezogenen Videos über PeerTube ein – insbesondere keine Aufnahmen, auf denen Schülerinnen und Schüler erkennbar sind, keine Besprechungen von Klassenarbeiten und keine vertraulichen Inhalte. Für solche Inhalte verwenden Sie den zugriffsgeschützten Dateibereich von Moodle selbst, bei dem das Berechtigungssystem von Moodle greift.</w:t>
+            </w:r>
+          </w:p>
+        </w:tc>
+      </w:tr>
+    </w:tbl>
+    <w:p>
+      <w:pPr>
+        <w:spacing w:after="0" w:before="0"/>
+      </w:pPr>
+      <w:r>
+        <w:rPr>
+          <w:sz w:val="12"/>
+          <w:szCs w:val="12"/>
+        </w:rPr>
+        <w:t xml:space="preserve"/>
+      </w:r>
+    </w:p>
+    <w:tbl>
+      <w:tblPr>
+        <w:tblW w:type="dxa" w:w="9026"/>
+        <w:tblBorders>
+          <w:top w:val="single" w:color="375623" w:sz="4"/>
+          <w:left w:val="thick" w:color="375623" w:sz="16"/>
+          <w:bottom w:val="single" w:color="375623" w:sz="4"/>
+          <w:right w:val="single" w:color="375623" w:sz="4"/>
+          <w:insideH w:val="single" w:color="auto" w:sz="4"/>
+          <w:insideV w:val="single" w:color="auto" w:sz="4"/>
+        </w:tblBorders>
+      </w:tblPr>
+      <w:tblGrid>
+        <w:gridCol w:w="9026"/>
+      </w:tblGrid>
+      <w:tr>
+        <w:tc>
+          <w:tcPr>
+            <w:tcBorders>
+              <w:top w:val="none" w:color="AAAAAA" w:sz="4"/>
+              <w:left w:val="none" w:color="AAAAAA" w:sz="4"/>
+              <w:bottom w:val="none" w:color="AAAAAA" w:sz="4"/>
+              <w:right w:val="none" w:color="AAAAAA" w:sz="4"/>
+            </w:tcBorders>
+            <w:shd w:fill="E2EFDA" w:val="clear"/>
+            <w:tcMar>
+              <w:top w:type="dxa" w:w="60"/>
+              <w:left w:type="dxa" w:w="140"/>
+              <w:bottom w:type="dxa" w:w="20"/>
+              <w:right w:type="dxa" w:w="140"/>
+            </w:tcMar>
+          </w:tcPr>
+          <w:p>
+            <w:pPr>
+              <w:spacing w:after="0" w:before="0"/>
+              <w:jc w:val="left"/>
+            </w:pPr>
+            <w:r>
+              <w:rPr>
+                <w:rFonts w:ascii="Arial" w:cs="Arial" w:eastAsia="Arial" w:hAnsi="Arial"/>
+                <w:b/>
+                <w:bCs/>
+                <w:i w:val="false"/>
+                <w:iCs w:val="false"/>
+                <w:color w:val="375623"/>
+                <w:sz w:val="18"/>
+                <w:szCs w:val="18"/>
+              </w:rPr>
+              <w:t xml:space="preserve">Gut geeignet für PeerTube</w:t>
+            </w:r>
+          </w:p>
+        </w:tc>
+      </w:tr>
+      <w:tr>
+        <w:tc>
+          <w:tcPr>
+            <w:tcBorders>
+              <w:top w:val="none" w:color="AAAAAA" w:sz="4"/>
+              <w:left w:val="none" w:color="AAAAAA" w:sz="4"/>
+              <w:bottom w:val="none" w:color="AAAAAA" w:sz="4"/>
+              <w:right w:val="none" w:color="AAAAAA" w:sz="4"/>
+            </w:tcBorders>
+            <w:shd w:fill="E2EFDA" w:val="clear"/>
+            <w:tcMar>
+              <w:top w:type="dxa" w:w="30"/>
+              <w:left w:type="dxa" w:w="140"/>
+              <w:bottom w:type="dxa" w:w="30"/>
+              <w:right w:type="dxa" w:w="140"/>
+            </w:tcMar>
+          </w:tcPr>
+          <w:p>
+            <w:pPr>
+              <w:spacing w:after="0" w:before="0"/>
+              <w:jc w:val="left"/>
+            </w:pPr>
+            <w:r>
+              <w:rPr>
+                <w:rFonts w:ascii="Arial" w:cs="Arial" w:eastAsia="Arial" w:hAnsi="Arial"/>
+                <w:b w:val="false"/>
+                <w:bCs w:val="false"/>
+                <w:i w:val="false"/>
+                <w:iCs w:val="false"/>
+                <w:color w:val="000000"/>
+                <w:sz w:val="18"/>
+                <w:szCs w:val="18"/>
+              </w:rPr>
+              <w:t xml:space="preserve">Gut geeignet für PeerTube sind allgemeine Lehr- und Erklärvideos ohne Personenbezug (z. B. ein Erklärvideo zum Satz des Pythagoras), bei denen eine etwaige Weitergabe unkritisch ist.</w:t>
+            </w:r>
+          </w:p>
+        </w:tc>
+      </w:tr>
+    </w:tbl>
     <w:p>
       <w:pPr>
         <w:pageBreakBefore/>
@@ -6868,6 +7402,56 @@
           <w:szCs w:val="20"/>
         </w:rPr>
         <w:t xml:space="preserve">Nein. Alle Lehrkräfte nutzen gemeinsam das von der Administration eingerichtete Moderator-Konto auf PeerTube. Jede Lehrkraft bekommt automatisch einen eigenen Kanal innerhalb dieses Kontos, sobald sie die Upload-Seite in Moodle zum ersten Mal aufruft. Die Kanäle sind nach dem Schema Schulkürzel_Nachname_Vorname benannt (Beispiel: gms_muster_mueller_maria).</w:t>
+      </w:r>
+    </w:p>
+    <w:p>
+      <w:pPr>
+        <w:spacing w:after="0" w:before="0"/>
+      </w:pPr>
+      <w:r>
+        <w:rPr>
+          <w:sz w:val="16"/>
+          <w:szCs w:val="16"/>
+        </w:rPr>
+        <w:t xml:space="preserve"/>
+      </w:r>
+    </w:p>
+    <w:p>
+      <w:pPr>
+        <w:pStyle w:val="Heading2"/>
+        <w:spacing w:after="80" w:before="240"/>
+      </w:pPr>
+      <w:r>
+        <w:rPr>
+          <w:rFonts w:ascii="Arial" w:cs="Arial" w:eastAsia="Arial" w:hAnsi="Arial"/>
+          <w:b/>
+          <w:bCs/>
+          <w:i w:val="false"/>
+          <w:iCs w:val="false"/>
+          <w:color w:val="2E75B6"/>
+          <w:sz w:val="24"/>
+          <w:szCs w:val="24"/>
+        </w:rPr>
+        <w:t xml:space="preserve">Kann jemand ein eingebundenes Video an Außenstehende weitergeben?</w:t>
+      </w:r>
+    </w:p>
+    <w:p>
+      <w:pPr>
+        <w:spacing w:after="80" w:before="80"/>
+        <w:jc w:val="left"/>
+      </w:pPr>
+      <w:r>
+        <w:rPr>
+          <w:rFonts w:ascii="Arial" w:cs="Arial" w:eastAsia="Arial" w:hAnsi="Arial"/>
+          <w:b w:val="false"/>
+          <w:bCs w:val="false"/>
+          <w:i w:val="false"/>
+          <w:iCs w:val="false"/>
+          <w:color w:val="000000"/>
+          <w:sz w:val="20"/>
+          <w:szCs w:val="20"/>
+        </w:rPr>
+        <w:t xml:space="preserve">Ja, das ist technisch möglich. Die Video-Adresse steht im Quelltext der Kursseite und kann von kenntnisreichen Personen ausgelesen und weitergegeben werden. Ein weitergegebener Link funktioniert dann auch außerhalb von Moodle. Deshalb gehören sensible oder personenbezogene Videos nicht auf PeerTube (siehe Abschnitt B.5), sondern in den zugriffsgeschützten Dateibereich von Moodle.</w:t>
       </w:r>
     </w:p>
     <w:p>
@@ -7478,20 +8062,7 @@
         <w:sz w:val="16"/>
         <w:szCs w:val="16"/>
       </w:rPr>
-      <w:t xml:space="preserve">PeerTube-Plugins für Moodle – Anleitung</w:t>
-    </w:r>
-    <w:r>
-      <w:rPr>
-        <w:rFonts w:ascii="Arial" w:cs="Arial" w:eastAsia="Arial" w:hAnsi="Arial"/>
-        <w:b w:val="false"/>
-        <w:bCs w:val="false"/>
-        <w:i w:val="false"/>
-        <w:iCs w:val="false"/>
-        <w:color w:val="888888"/>
-        <w:sz w:val="16"/>
-        <w:szCs w:val="16"/>
-      </w:rPr>
-      <w:t xml:space="preserve">   |   Moodle in Niedersachsen e. V.</w:t>
+      <w:t xml:space="preserve">PeerTube-Plugins für Moodle – Anleitung   |   Moodle in Niedersachsen e. V.</w:t>
     </w:r>
   </w:p>
 </w:hdr>

</xml_diff>